<commit_message>
Add Motz Loan Prediction project
</commit_message>
<xml_diff>
--- a/docs/DIAL3110_Loan_Prediction_Report.docx
+++ b/docs/DIAL3110_Loan_Prediction_Report.docx
@@ -201,7 +201,7 @@
               <w:rPr>
                 <w:rFonts w:ascii="Arial Narrow" w:hAnsi="Arial Narrow"/>
               </w:rPr>
-              <w:t>[Member 1]</w:t>
+              <w:t>&lt;your name&gt;</w:t>
             </w:r>
           </w:p>
         </w:tc>
@@ -214,7 +214,7 @@
               <w:rPr>
                 <w:rFonts w:ascii="Arial Narrow" w:hAnsi="Arial Narrow"/>
               </w:rPr>
-              <w:t>[ID]</w:t>
+              <w:t>&lt;student id&gt;</w:t>
             </w:r>
           </w:p>
         </w:tc>
@@ -227,7 +227,7 @@
               <w:rPr>
                 <w:rFonts w:ascii="Arial Narrow" w:hAnsi="Arial Narrow"/>
               </w:rPr>
-              <w:t>Data gathering, cleaning and descriptive analysis</w:t>
+              <w:t>Data gathering &amp; cleaning (Tasks 1-2)</w:t>
             </w:r>
           </w:p>
         </w:tc>
@@ -242,7 +242,7 @@
               <w:rPr>
                 <w:rFonts w:ascii="Arial Narrow" w:hAnsi="Arial Narrow"/>
               </w:rPr>
-              <w:t>[Member 2]</w:t>
+              <w:t>&lt;your name&gt;</w:t>
             </w:r>
           </w:p>
         </w:tc>
@@ -255,7 +255,7 @@
               <w:rPr>
                 <w:rFonts w:ascii="Arial Narrow" w:hAnsi="Arial Narrow"/>
               </w:rPr>
-              <w:t>[ID]</w:t>
+              <w:t>&lt;student id&gt;</w:t>
             </w:r>
           </w:p>
         </w:tc>
@@ -268,7 +268,7 @@
               <w:rPr>
                 <w:rFonts w:ascii="Arial Narrow" w:hAnsi="Arial Narrow"/>
               </w:rPr>
-              <w:t>Pre-processing, model training and tuning</w:t>
+              <w:t>Model determination, training &amp; tuning (Tasks 3-5)</w:t>
             </w:r>
           </w:p>
         </w:tc>
@@ -283,7 +283,7 @@
               <w:rPr>
                 <w:rFonts w:ascii="Arial Narrow" w:hAnsi="Arial Narrow"/>
               </w:rPr>
-              <w:t>[Member 3]</w:t>
+              <w:t>&lt;your name&gt;</w:t>
             </w:r>
           </w:p>
         </w:tc>
@@ -296,7 +296,7 @@
               <w:rPr>
                 <w:rFonts w:ascii="Arial Narrow" w:hAnsi="Arial Narrow"/>
               </w:rPr>
-              <w:t>[ID]</w:t>
+              <w:t>&lt;student id&gt;</w:t>
             </w:r>
           </w:p>
         </w:tc>
@@ -309,7 +309,48 @@
               <w:rPr>
                 <w:rFonts w:ascii="Arial Narrow" w:hAnsi="Arial Narrow"/>
               </w:rPr>
-              <w:t>Dashboard development, report and presentation</w:t>
+              <w:t>Dashboard &amp; explainability (Task 6)</w:t>
+            </w:r>
+          </w:p>
+        </w:tc>
+      </w:tr>
+      <w:tr>
+        <w:tc>
+          <w:tcPr>
+            <w:tcW w:type="dxa" w:w="3216"/>
+          </w:tcPr>
+          <w:p>
+            <w:r>
+              <w:rPr>
+                <w:rFonts w:ascii="Arial Narrow" w:hAnsi="Arial Narrow"/>
+              </w:rPr>
+              <w:t>&lt;your name&gt;</w:t>
+            </w:r>
+          </w:p>
+        </w:tc>
+        <w:tc>
+          <w:tcPr>
+            <w:tcW w:type="dxa" w:w="3216"/>
+          </w:tcPr>
+          <w:p>
+            <w:r>
+              <w:rPr>
+                <w:rFonts w:ascii="Arial Narrow" w:hAnsi="Arial Narrow"/>
+              </w:rPr>
+              <w:t>&lt;student id&gt;</w:t>
+            </w:r>
+          </w:p>
+        </w:tc>
+        <w:tc>
+          <w:tcPr>
+            <w:tcW w:type="dxa" w:w="3216"/>
+          </w:tcPr>
+          <w:p>
+            <w:r>
+              <w:rPr>
+                <w:rFonts w:ascii="Arial Narrow" w:hAnsi="Arial Narrow"/>
+              </w:rPr>
+              <w:t>Report &amp; presentation (Tasks 7-8)</w:t>
             </w:r>
           </w:p>
         </w:tc>
@@ -322,7 +363,34 @@
           <w:b w:val="0"/>
           <w:i/>
         </w:rPr>
-        <w:t>Note: replace the placeholders above with the actual group member details.</w:t>
+        <w:t>Replace each &lt;your name&gt; / &lt;student id&gt; placeholder before submitting.</w:t>
+      </w:r>
+    </w:p>
+    <w:p>
+      <w:r>
+        <w:br w:type="page"/>
+      </w:r>
+    </w:p>
+    <w:p>
+      <w:pPr>
+        <w:jc w:val="center"/>
+      </w:pPr>
+      <w:r>
+        <w:rPr>
+          <w:rFonts w:ascii="Arial Narrow" w:hAnsi="Arial Narrow"/>
+          <w:b/>
+          <w:sz w:val="32"/>
+        </w:rPr>
+        <w:t>Table of Contents</w:t>
+      </w:r>
+    </w:p>
+    <w:p>
+      <w:r>
+        <w:fldChar w:fldCharType="begin"/>
+        <w:instrText xml:space="preserve">TOC \o "1-3" \h \z \u</w:instrText>
+        <w:fldChar w:fldCharType="separate"/>
+        <w:t>Right-click and choose 'Update Field' to build the table of contents.</w:t>
+        <w:fldChar w:fldCharType="end"/>
       </w:r>
     </w:p>
     <w:p>
@@ -349,7 +417,7 @@
           <w:b w:val="0"/>
           <w:i w:val="0"/>
         </w:rPr>
-        <w:t>This project develops a supervised machine learning system that predicts whether a loan application submitted to Motz Financial Services will be approved. Using an applicant dataset of gender, marital status, dependents, education, employment, income, loan amount, loan term, credit history and property area, the study follows a complete data-science workflow: data gathering and cleaning, handling of missing values and outliers, exploratory statistical analysis, feature engineering, model determination, training, hyper-parameter tuning and deployment through an interactive prediction dashboard. Nine candidate classifiers - seven base learners (logistic regression, decision tree, random forest, k-nearest neighbours, Gaussian naive Bayes, support vector machine and gradient boosting) plus advanced soft-voting and stacking ensembles - were compared using stratified five-fold cross-validation. The selected model achieved 83.5% accuracy, 0.897 F1 and 0.763 ROC-AUC on a held-out test set, comfortably exceeding the majority-class baseline. The results confirm that credit history is by far the strongest predictor of loan approval. The final model is served through a Streamlit dashboard that supports both single-applicant and batch scoring, providing Motz Financial Services with a practical, interpretable decision-support tool.</w:t>
+        <w:t>This project develops a supervised machine learning system that predicts whether a loan application submitted to Motz Financial Services will be approved. Using an applicant dataset of gender, marital status, dependents, education, employment, income, loan amount, loan term, credit history and property area, the study follows a complete data-science workflow: data gathering and cleaning, handling of missing values and outliers, exploratory statistical analysis, feature engineering, model determination, training, hyper-parameter tuning and deployment through an interactive prediction dashboard. Nine candidate classifiers - seven base learners (logistic regression, decision tree, random forest, k-nearest neighbours, Gaussian naive Bayes, support vector machine and gradient boosting) plus advanced soft-voting and stacking ensembles - were compared using stratified five-fold cross-validation. The selected model achieved 85.4% accuracy, 0.903 F1 and 0.814 ROC-AUC on a held-out test set, comfortably exceeding the majority-class baseline. The results confirm that credit history is by far the strongest predictor of loan approval. The final model is served through a Streamlit dashboard that supports both single-applicant and batch scoring, providing Motz Financial Services with a practical, interpretable decision-support tool.</w:t>
       </w:r>
     </w:p>
     <w:p>
@@ -521,7 +589,7 @@
           <w:b w:val="0"/>
           <w:i w:val="0"/>
         </w:rPr>
-        <w:t>The dataset contains 1,000 loan applications with 12 fields: a unique Loan_ID, six categorical background attributes (Gender, Married, Dependents, Education, Self_Employed, Property_Area), four numeric/financial attributes (ApplicantIncome, CoapplicantIncome, LoanAmount, Loan_Amount_Term), the Credit_History indicator and the target Loan_Status (Y/N). The pipeline module generate_dataset.py reproduces this extract exactly and is re-runnable with a fixed random seed for full reproducibility.</w:t>
+        <w:t>The dataset contains 614 loan applications with 13 columns: a unique Loan_ID, six categorical background attributes (Gender, Married, Dependents, Education, Self_Employed, Property_Area), four numeric/financial attributes (ApplicantIncome, CoapplicantIncome, LoanAmount, Loan_Amount_Term), the Credit_History indicator and the target Loan_Status (Y/N). The data is the public Kaggle "Loan Prediction Problem" dataset, fetched reproducibly at build time by src/fetch_kaggle_data.py, with a committed fallback copy so the pipeline also runs offline.</w:t>
       </w:r>
     </w:p>
     <w:p>
@@ -618,6 +686,16 @@
           <w:i w:val="0"/>
         </w:rPr>
         <w:t>Outliers in the numeric columns are detected using the inter-quartile range (IQR) rule: values below Q1 - 1.5*IQR or above Q3 + 1.5*IQR are flagged. Rather than deleting records (which would lose legitimate high-income applicants), outliers are winsorised - capped at the IQR fences. This retains every record while preventing extreme values from distorting the scaling and the fitted model.</w:t>
+      </w:r>
+    </w:p>
+    <w:p>
+      <w:r>
+        <w:rPr>
+          <w:rFonts w:ascii="Arial Narrow" w:hAnsi="Arial Narrow"/>
+          <w:b w:val="0"/>
+          <w:i w:val="0"/>
+        </w:rPr>
+        <w:t>One guard is applied: a column whose quartiles coincide (zero IQR) has no meaningful fences - clipping would flatten it to a single value. Such columns (Loan_Amount_Term) are therefore left unchanged, preserving their genuine spread. This matters for Loan_Amount_Term, where most applications share a 360-month term but a minority differ; winsorising would otherwise have collapsed the feature to a constant and removed information the model can use.</w:t>
       </w:r>
     </w:p>
     <w:p>
@@ -802,7 +880,7 @@
               <w:rPr>
                 <w:rFonts w:ascii="Arial Narrow" w:hAnsi="Arial Narrow"/>
               </w:rPr>
-              <w:t>5,262</w:t>
+              <w:t>4,617</w:t>
             </w:r>
           </w:p>
         </w:tc>
@@ -815,7 +893,7 @@
               <w:rPr>
                 <w:rFonts w:ascii="Arial Narrow" w:hAnsi="Arial Narrow"/>
               </w:rPr>
-              <w:t>1,318</w:t>
+              <w:t>1,420</w:t>
             </w:r>
           </w:p>
         </w:tc>
@@ -828,7 +906,7 @@
               <w:rPr>
                 <w:rFonts w:ascii="Arial Narrow" w:hAnsi="Arial Narrow"/>
               </w:rPr>
-              <w:t>~201,000</w:t>
+              <w:t>137</w:t>
             </w:r>
           </w:p>
         </w:tc>
@@ -841,7 +919,7 @@
               <w:rPr>
                 <w:rFonts w:ascii="Arial Narrow" w:hAnsi="Arial Narrow"/>
               </w:rPr>
-              <w:t>310</w:t>
+              <w:t>342</w:t>
             </w:r>
           </w:p>
         </w:tc>
@@ -869,7 +947,7 @@
               <w:rPr>
                 <w:rFonts w:ascii="Arial Narrow" w:hAnsi="Arial Narrow"/>
               </w:rPr>
-              <w:t>2,907</w:t>
+              <w:t>2,480</w:t>
             </w:r>
           </w:p>
         </w:tc>
@@ -882,7 +960,7 @@
               <w:rPr>
                 <w:rFonts w:ascii="Arial Narrow" w:hAnsi="Arial Narrow"/>
               </w:rPr>
-              <w:t>1,595</w:t>
+              <w:t>1,625</w:t>
             </w:r>
           </w:p>
         </w:tc>
@@ -895,7 +973,7 @@
               <w:rPr>
                 <w:rFonts w:ascii="Arial Narrow" w:hAnsi="Arial Narrow"/>
               </w:rPr>
-              <w:t>~90,000</w:t>
+              <w:t>56</w:t>
             </w:r>
           </w:p>
         </w:tc>
@@ -908,7 +986,7 @@
               <w:rPr>
                 <w:rFonts w:ascii="Arial Narrow" w:hAnsi="Arial Narrow"/>
               </w:rPr>
-              <w:t>91</w:t>
+              <w:t>64</w:t>
             </w:r>
           </w:p>
         </w:tc>
@@ -936,7 +1014,7 @@
               <w:rPr>
                 <w:rFonts w:ascii="Arial Narrow" w:hAnsi="Arial Narrow"/>
               </w:rPr>
-              <w:t>825</w:t>
+              <w:t>150</w:t>
             </w:r>
           </w:p>
         </w:tc>
@@ -962,7 +1040,7 @@
               <w:rPr>
                 <w:rFonts w:ascii="Arial Narrow" w:hAnsi="Arial Narrow"/>
               </w:rPr>
-              <w:t>30,000</w:t>
+              <w:t>9</w:t>
             </w:r>
           </w:p>
         </w:tc>
@@ -975,7 +1053,7 @@
               <w:rPr>
                 <w:rFonts w:ascii="Arial Narrow" w:hAnsi="Arial Narrow"/>
               </w:rPr>
-              <w:t>60</w:t>
+              <w:t>12</w:t>
             </w:r>
           </w:p>
         </w:tc>
@@ -1003,7 +1081,7 @@
               <w:rPr>
                 <w:rFonts w:ascii="Arial Narrow" w:hAnsi="Arial Narrow"/>
               </w:rPr>
-              <w:t>12,185</w:t>
+              <w:t>10,171</w:t>
             </w:r>
           </w:p>
         </w:tc>
@@ -1016,7 +1094,7 @@
               <w:rPr>
                 <w:rFonts w:ascii="Arial Narrow" w:hAnsi="Arial Narrow"/>
               </w:rPr>
-              <w:t>5,419</w:t>
+              <w:t>5,743</w:t>
             </w:r>
           </w:p>
         </w:tc>
@@ -1029,7 +1107,7 @@
               <w:rPr>
                 <w:rFonts w:ascii="Arial Narrow" w:hAnsi="Arial Narrow"/>
               </w:rPr>
-              <w:t>700,000</w:t>
+              <w:t>262</w:t>
             </w:r>
           </w:p>
         </w:tc>
@@ -1206,6 +1284,66 @@
     </w:p>
     <w:p>
       <w:pPr>
+        <w:pStyle w:val="Heading2"/>
+      </w:pPr>
+      <w:r>
+        <w:rPr>
+          <w:rFonts w:ascii="Arial Narrow" w:hAnsi="Arial Narrow"/>
+          <w:color w:val="1F3B57"/>
+        </w:rPr>
+        <w:t>2.5 Key Exploratory Findings</w:t>
+      </w:r>
+    </w:p>
+    <w:p>
+      <w:pPr>
+        <w:pStyle w:val="ListBullet"/>
+      </w:pPr>
+      <w:r>
+        <w:rPr>
+          <w:rFonts w:ascii="Arial Narrow" w:hAnsi="Arial Narrow"/>
+          <w:sz w:val="24"/>
+        </w:rPr>
+        <w:t>Class balance: 422 of 614 applications were approved (68.7%), so the target is moderately imbalanced and the majority-class accuracy of 68.7% is the baseline any model must beat.</w:t>
+      </w:r>
+    </w:p>
+    <w:p>
+      <w:pPr>
+        <w:pStyle w:val="ListBullet"/>
+      </w:pPr>
+      <w:r>
+        <w:rPr>
+          <w:rFonts w:ascii="Arial Narrow" w:hAnsi="Arial Narrow"/>
+          <w:sz w:val="24"/>
+        </w:rPr>
+        <w:t>Credit history is the strongest signal: the approval rate is 79.0% for applicants with a good credit history versus 7.9% for those without (r = 0.541).</w:t>
+      </w:r>
+    </w:p>
+    <w:p>
+      <w:pPr>
+        <w:pStyle w:val="ListBullet"/>
+      </w:pPr>
+      <w:r>
+        <w:rPr>
+          <w:rFonts w:ascii="Arial Narrow" w:hAnsi="Arial Narrow"/>
+          <w:sz w:val="24"/>
+        </w:rPr>
+        <w:t>Property area adds secondary signal: semiurban applications are approved at 76.8%, urban at 65.8% and rural at 61.5%.</w:t>
+      </w:r>
+    </w:p>
+    <w:p>
+      <w:pPr>
+        <w:pStyle w:val="ListBullet"/>
+      </w:pPr>
+      <w:r>
+        <w:rPr>
+          <w:rFonts w:ascii="Arial Narrow" w:hAnsi="Arial Narrow"/>
+          <w:sz w:val="24"/>
+        </w:rPr>
+        <w:t>Income is a surprisingly weak predictor of approval in this dataset (r = -0.000): repayment behaviour (credit history) dominates raw earning power, which is why the engineered affordability ratios are useful but secondary.</w:t>
+      </w:r>
+    </w:p>
+    <w:p>
+      <w:pPr>
         <w:pStyle w:val="Heading1"/>
       </w:pPr>
       <w:r>
@@ -1315,7 +1453,7 @@
           <w:b w:val="0"/>
           <w:i w:val="0"/>
         </w:rPr>
-        <w:t>Feature tuning examined the skewness of income and loan variables and the correlation of each engineered feature with the target. The log transform reduced the LoanAmount skewness from 0.847 to -0.355, producing a more symmetric distribution that benefits distance- and linear-based models. Correlation analysis showed Credit_History as the dominant signal (r = 0.461), while income-derived features carried weaker independent signal; they were retained because they improved the model's discrimination and interpretability.</w:t>
+        <w:t>Feature tuning examined the skewness of income and loan variables and the correlation of each engineered feature with the target. The log transform reduced the LoanAmount skewness from 0.684 to -0.896, producing a more symmetric distribution that benefits distance- and linear-based models. Correlation analysis showed Credit_History as the dominant signal (r = 0.541), while income-derived features carried weaker independent signal; they were retained because they improved the model's discrimination and interpretability.</w:t>
       </w:r>
     </w:p>
     <w:p>
@@ -1420,6 +1558,60 @@
               <w:rPr>
                 <w:rFonts w:ascii="Arial Narrow" w:hAnsi="Arial Narrow"/>
               </w:rPr>
+              <w:t>Support Vector Machine</w:t>
+            </w:r>
+          </w:p>
+        </w:tc>
+        <w:tc>
+          <w:tcPr>
+            <w:tcW w:type="dxa" w:w="2412"/>
+          </w:tcPr>
+          <w:p>
+            <w:r>
+              <w:rPr>
+                <w:rFonts w:ascii="Arial Narrow" w:hAnsi="Arial Narrow"/>
+              </w:rPr>
+              <w:t>0.7922</w:t>
+            </w:r>
+          </w:p>
+        </w:tc>
+        <w:tc>
+          <w:tcPr>
+            <w:tcW w:type="dxa" w:w="2412"/>
+          </w:tcPr>
+          <w:p>
+            <w:r>
+              <w:rPr>
+                <w:rFonts w:ascii="Arial Narrow" w:hAnsi="Arial Narrow"/>
+              </w:rPr>
+              <w:t>0.0419</w:t>
+            </w:r>
+          </w:p>
+        </w:tc>
+        <w:tc>
+          <w:tcPr>
+            <w:tcW w:type="dxa" w:w="2412"/>
+          </w:tcPr>
+          <w:p>
+            <w:r>
+              <w:rPr>
+                <w:rFonts w:ascii="Arial Narrow" w:hAnsi="Arial Narrow"/>
+              </w:rPr>
+              <w:t>0.7640</w:t>
+            </w:r>
+          </w:p>
+        </w:tc>
+      </w:tr>
+      <w:tr>
+        <w:tc>
+          <w:tcPr>
+            <w:tcW w:type="dxa" w:w="2412"/>
+          </w:tcPr>
+          <w:p>
+            <w:r>
+              <w:rPr>
+                <w:rFonts w:ascii="Arial Narrow" w:hAnsi="Arial Narrow"/>
+              </w:rPr>
               <w:t>Soft Voting Ensemble</w:t>
             </w:r>
           </w:p>
@@ -1433,7 +1625,7 @@
               <w:rPr>
                 <w:rFonts w:ascii="Arial Narrow" w:hAnsi="Arial Narrow"/>
               </w:rPr>
-              <w:t>0.8450</w:t>
+              <w:t>0.7901</w:t>
             </w:r>
           </w:p>
         </w:tc>
@@ -1446,7 +1638,7 @@
               <w:rPr>
                 <w:rFonts w:ascii="Arial Narrow" w:hAnsi="Arial Narrow"/>
               </w:rPr>
-              <w:t>0.0170</w:t>
+              <w:t>0.0463</w:t>
             </w:r>
           </w:p>
         </w:tc>
@@ -1459,7 +1651,61 @@
               <w:rPr>
                 <w:rFonts w:ascii="Arial Narrow" w:hAnsi="Arial Narrow"/>
               </w:rPr>
-              <w:t>0.6970</w:t>
+              <w:t>0.7744</w:t>
+            </w:r>
+          </w:p>
+        </w:tc>
+      </w:tr>
+      <w:tr>
+        <w:tc>
+          <w:tcPr>
+            <w:tcW w:type="dxa" w:w="2412"/>
+          </w:tcPr>
+          <w:p>
+            <w:r>
+              <w:rPr>
+                <w:rFonts w:ascii="Arial Narrow" w:hAnsi="Arial Narrow"/>
+              </w:rPr>
+              <w:t>Logistic Regression</w:t>
+            </w:r>
+          </w:p>
+        </w:tc>
+        <w:tc>
+          <w:tcPr>
+            <w:tcW w:type="dxa" w:w="2412"/>
+          </w:tcPr>
+          <w:p>
+            <w:r>
+              <w:rPr>
+                <w:rFonts w:ascii="Arial Narrow" w:hAnsi="Arial Narrow"/>
+              </w:rPr>
+              <w:t>0.7901</w:t>
+            </w:r>
+          </w:p>
+        </w:tc>
+        <w:tc>
+          <w:tcPr>
+            <w:tcW w:type="dxa" w:w="2412"/>
+          </w:tcPr>
+          <w:p>
+            <w:r>
+              <w:rPr>
+                <w:rFonts w:ascii="Arial Narrow" w:hAnsi="Arial Narrow"/>
+              </w:rPr>
+              <w:t>0.0453</w:t>
+            </w:r>
+          </w:p>
+        </w:tc>
+        <w:tc>
+          <w:tcPr>
+            <w:tcW w:type="dxa" w:w="2412"/>
+          </w:tcPr>
+          <w:p>
+            <w:r>
+              <w:rPr>
+                <w:rFonts w:ascii="Arial Narrow" w:hAnsi="Arial Narrow"/>
+              </w:rPr>
+              <w:t>0.7265</w:t>
             </w:r>
           </w:p>
         </w:tc>
@@ -1487,7 +1733,7 @@
               <w:rPr>
                 <w:rFonts w:ascii="Arial Narrow" w:hAnsi="Arial Narrow"/>
               </w:rPr>
-              <w:t>0.8438</w:t>
+              <w:t>0.7861</w:t>
             </w:r>
           </w:p>
         </w:tc>
@@ -1500,7 +1746,7 @@
               <w:rPr>
                 <w:rFonts w:ascii="Arial Narrow" w:hAnsi="Arial Narrow"/>
               </w:rPr>
-              <w:t>0.0177</w:t>
+              <w:t>0.0417</w:t>
             </w:r>
           </w:p>
         </w:tc>
@@ -1513,7 +1759,7 @@
               <w:rPr>
                 <w:rFonts w:ascii="Arial Narrow" w:hAnsi="Arial Narrow"/>
               </w:rPr>
-              <w:t>0.7412</w:t>
+              <w:t>0.7756</w:t>
             </w:r>
           </w:p>
         </w:tc>
@@ -1528,7 +1774,7 @@
               <w:rPr>
                 <w:rFonts w:ascii="Arial Narrow" w:hAnsi="Arial Narrow"/>
               </w:rPr>
-              <w:t>Logistic Regression</w:t>
+              <w:t>Random Forest</w:t>
             </w:r>
           </w:p>
         </w:tc>
@@ -1541,7 +1787,7 @@
               <w:rPr>
                 <w:rFonts w:ascii="Arial Narrow" w:hAnsi="Arial Narrow"/>
               </w:rPr>
-              <w:t>0.8438</w:t>
+              <w:t>0.7820</w:t>
             </w:r>
           </w:p>
         </w:tc>
@@ -1554,7 +1800,7 @@
               <w:rPr>
                 <w:rFonts w:ascii="Arial Narrow" w:hAnsi="Arial Narrow"/>
               </w:rPr>
-              <w:t>0.0177</w:t>
+              <w:t>0.0480</w:t>
             </w:r>
           </w:p>
         </w:tc>
@@ -1567,7 +1813,7 @@
               <w:rPr>
                 <w:rFonts w:ascii="Arial Narrow" w:hAnsi="Arial Narrow"/>
               </w:rPr>
-              <w:t>0.7332</w:t>
+              <w:t>0.7806</w:t>
             </w:r>
           </w:p>
         </w:tc>
@@ -1582,7 +1828,7 @@
               <w:rPr>
                 <w:rFonts w:ascii="Arial Narrow" w:hAnsi="Arial Narrow"/>
               </w:rPr>
-              <w:t>Support Vector Machine</w:t>
+              <w:t>K-Nearest Neighbours</w:t>
             </w:r>
           </w:p>
         </w:tc>
@@ -1595,7 +1841,7 @@
               <w:rPr>
                 <w:rFonts w:ascii="Arial Narrow" w:hAnsi="Arial Narrow"/>
               </w:rPr>
-              <w:t>0.8438</w:t>
+              <w:t>0.7698</w:t>
             </w:r>
           </w:p>
         </w:tc>
@@ -1608,7 +1854,7 @@
               <w:rPr>
                 <w:rFonts w:ascii="Arial Narrow" w:hAnsi="Arial Narrow"/>
               </w:rPr>
-              <w:t>0.0177</w:t>
+              <w:t>0.0336</w:t>
             </w:r>
           </w:p>
         </w:tc>
@@ -1621,7 +1867,61 @@
               <w:rPr>
                 <w:rFonts w:ascii="Arial Narrow" w:hAnsi="Arial Narrow"/>
               </w:rPr>
-              <w:t>0.7067</w:t>
+              <w:t>0.7280</w:t>
+            </w:r>
+          </w:p>
+        </w:tc>
+      </w:tr>
+      <w:tr>
+        <w:tc>
+          <w:tcPr>
+            <w:tcW w:type="dxa" w:w="2412"/>
+          </w:tcPr>
+          <w:p>
+            <w:r>
+              <w:rPr>
+                <w:rFonts w:ascii="Arial Narrow" w:hAnsi="Arial Narrow"/>
+              </w:rPr>
+              <w:t>Gradient Boosting</w:t>
+            </w:r>
+          </w:p>
+        </w:tc>
+        <w:tc>
+          <w:tcPr>
+            <w:tcW w:type="dxa" w:w="2412"/>
+          </w:tcPr>
+          <w:p>
+            <w:r>
+              <w:rPr>
+                <w:rFonts w:ascii="Arial Narrow" w:hAnsi="Arial Narrow"/>
+              </w:rPr>
+              <w:t>0.7697</w:t>
+            </w:r>
+          </w:p>
+        </w:tc>
+        <w:tc>
+          <w:tcPr>
+            <w:tcW w:type="dxa" w:w="2412"/>
+          </w:tcPr>
+          <w:p>
+            <w:r>
+              <w:rPr>
+                <w:rFonts w:ascii="Arial Narrow" w:hAnsi="Arial Narrow"/>
+              </w:rPr>
+              <w:t>0.0546</w:t>
+            </w:r>
+          </w:p>
+        </w:tc>
+        <w:tc>
+          <w:tcPr>
+            <w:tcW w:type="dxa" w:w="2412"/>
+          </w:tcPr>
+          <w:p>
+            <w:r>
+              <w:rPr>
+                <w:rFonts w:ascii="Arial Narrow" w:hAnsi="Arial Narrow"/>
+              </w:rPr>
+              <w:t>0.7337</w:t>
             </w:r>
           </w:p>
         </w:tc>
@@ -1649,7 +1949,7 @@
               <w:rPr>
                 <w:rFonts w:ascii="Arial Narrow" w:hAnsi="Arial Narrow"/>
               </w:rPr>
-              <w:t>0.8325</w:t>
+              <w:t>0.7697</w:t>
             </w:r>
           </w:p>
         </w:tc>
@@ -1662,7 +1962,7 @@
               <w:rPr>
                 <w:rFonts w:ascii="Arial Narrow" w:hAnsi="Arial Narrow"/>
               </w:rPr>
-              <w:t>0.0092</w:t>
+              <w:t>0.0515</w:t>
             </w:r>
           </w:p>
         </w:tc>
@@ -1675,169 +1975,7 @@
               <w:rPr>
                 <w:rFonts w:ascii="Arial Narrow" w:hAnsi="Arial Narrow"/>
               </w:rPr>
-              <w:t>0.7406</w:t>
-            </w:r>
-          </w:p>
-        </w:tc>
-      </w:tr>
-      <w:tr>
-        <w:tc>
-          <w:tcPr>
-            <w:tcW w:type="dxa" w:w="2412"/>
-          </w:tcPr>
-          <w:p>
-            <w:r>
-              <w:rPr>
-                <w:rFonts w:ascii="Arial Narrow" w:hAnsi="Arial Narrow"/>
-              </w:rPr>
-              <w:t>Gradient Boosting</w:t>
-            </w:r>
-          </w:p>
-        </w:tc>
-        <w:tc>
-          <w:tcPr>
-            <w:tcW w:type="dxa" w:w="2412"/>
-          </w:tcPr>
-          <w:p>
-            <w:r>
-              <w:rPr>
-                <w:rFonts w:ascii="Arial Narrow" w:hAnsi="Arial Narrow"/>
-              </w:rPr>
-              <w:t>0.8325</w:t>
-            </w:r>
-          </w:p>
-        </w:tc>
-        <w:tc>
-          <w:tcPr>
-            <w:tcW w:type="dxa" w:w="2412"/>
-          </w:tcPr>
-          <w:p>
-            <w:r>
-              <w:rPr>
-                <w:rFonts w:ascii="Arial Narrow" w:hAnsi="Arial Narrow"/>
-              </w:rPr>
-              <w:t>0.0133</w:t>
-            </w:r>
-          </w:p>
-        </w:tc>
-        <w:tc>
-          <w:tcPr>
-            <w:tcW w:type="dxa" w:w="2412"/>
-          </w:tcPr>
-          <w:p>
-            <w:r>
-              <w:rPr>
-                <w:rFonts w:ascii="Arial Narrow" w:hAnsi="Arial Narrow"/>
-              </w:rPr>
-              <w:t>0.6849</w:t>
-            </w:r>
-          </w:p>
-        </w:tc>
-      </w:tr>
-      <w:tr>
-        <w:tc>
-          <w:tcPr>
-            <w:tcW w:type="dxa" w:w="2412"/>
-          </w:tcPr>
-          <w:p>
-            <w:r>
-              <w:rPr>
-                <w:rFonts w:ascii="Arial Narrow" w:hAnsi="Arial Narrow"/>
-              </w:rPr>
-              <w:t>Random Forest</w:t>
-            </w:r>
-          </w:p>
-        </w:tc>
-        <w:tc>
-          <w:tcPr>
-            <w:tcW w:type="dxa" w:w="2412"/>
-          </w:tcPr>
-          <w:p>
-            <w:r>
-              <w:rPr>
-                <w:rFonts w:ascii="Arial Narrow" w:hAnsi="Arial Narrow"/>
-              </w:rPr>
-              <w:t>0.8325</w:t>
-            </w:r>
-          </w:p>
-        </w:tc>
-        <w:tc>
-          <w:tcPr>
-            <w:tcW w:type="dxa" w:w="2412"/>
-          </w:tcPr>
-          <w:p>
-            <w:r>
-              <w:rPr>
-                <w:rFonts w:ascii="Arial Narrow" w:hAnsi="Arial Narrow"/>
-              </w:rPr>
-              <w:t>0.0214</w:t>
-            </w:r>
-          </w:p>
-        </w:tc>
-        <w:tc>
-          <w:tcPr>
-            <w:tcW w:type="dxa" w:w="2412"/>
-          </w:tcPr>
-          <w:p>
-            <w:r>
-              <w:rPr>
-                <w:rFonts w:ascii="Arial Narrow" w:hAnsi="Arial Narrow"/>
-              </w:rPr>
-              <w:t>0.6829</w:t>
-            </w:r>
-          </w:p>
-        </w:tc>
-      </w:tr>
-      <w:tr>
-        <w:tc>
-          <w:tcPr>
-            <w:tcW w:type="dxa" w:w="2412"/>
-          </w:tcPr>
-          <w:p>
-            <w:r>
-              <w:rPr>
-                <w:rFonts w:ascii="Arial Narrow" w:hAnsi="Arial Narrow"/>
-              </w:rPr>
-              <w:t>K-Nearest Neighbours</w:t>
-            </w:r>
-          </w:p>
-        </w:tc>
-        <w:tc>
-          <w:tcPr>
-            <w:tcW w:type="dxa" w:w="2412"/>
-          </w:tcPr>
-          <w:p>
-            <w:r>
-              <w:rPr>
-                <w:rFonts w:ascii="Arial Narrow" w:hAnsi="Arial Narrow"/>
-              </w:rPr>
-              <w:t>0.8300</w:t>
-            </w:r>
-          </w:p>
-        </w:tc>
-        <w:tc>
-          <w:tcPr>
-            <w:tcW w:type="dxa" w:w="2412"/>
-          </w:tcPr>
-          <w:p>
-            <w:r>
-              <w:rPr>
-                <w:rFonts w:ascii="Arial Narrow" w:hAnsi="Arial Narrow"/>
-              </w:rPr>
-              <w:t>0.0100</w:t>
-            </w:r>
-          </w:p>
-        </w:tc>
-        <w:tc>
-          <w:tcPr>
-            <w:tcW w:type="dxa" w:w="2412"/>
-          </w:tcPr>
-          <w:p>
-            <w:r>
-              <w:rPr>
-                <w:rFonts w:ascii="Arial Narrow" w:hAnsi="Arial Narrow"/>
-              </w:rPr>
-              <w:t>0.6896</w:t>
+              <w:t>0.7204</w:t>
             </w:r>
           </w:p>
         </w:tc>
@@ -1865,7 +2003,7 @@
               <w:rPr>
                 <w:rFonts w:ascii="Arial Narrow" w:hAnsi="Arial Narrow"/>
               </w:rPr>
-              <w:t>0.7188</w:t>
+              <w:t>0.6822</w:t>
             </w:r>
           </w:p>
         </w:tc>
@@ -1878,7 +2016,7 @@
               <w:rPr>
                 <w:rFonts w:ascii="Arial Narrow" w:hAnsi="Arial Narrow"/>
               </w:rPr>
-              <w:t>0.0253</w:t>
+              <w:t>0.0430</w:t>
             </w:r>
           </w:p>
         </w:tc>
@@ -1891,7 +2029,7 @@
               <w:rPr>
                 <w:rFonts w:ascii="Arial Narrow" w:hAnsi="Arial Narrow"/>
               </w:rPr>
-              <w:t>0.6616</w:t>
+              <w:t>0.6309</w:t>
             </w:r>
           </w:p>
         </w:tc>
@@ -1956,7 +2094,7 @@
           <w:b w:val="0"/>
           <w:i w:val="0"/>
         </w:rPr>
-        <w:t>Logistic regression produced the best cross-validated accuracy (84.5%) and the joint-highest ROC-AUC, while remaining fast, interpretable and well-calibrated for probability output. It was therefore selected as the production model.</w:t>
+        <w:t>The Support Vector Machine produced the best cross-validated accuracy (79.2%) and a strong ROC-AUC of 0.764, combining the complementary strengths of its base learners. It was therefore selected as the production model.</w:t>
       </w:r>
     </w:p>
     <w:p>
@@ -1978,7 +2116,7 @@
           <w:b w:val="0"/>
           <w:i w:val="0"/>
         </w:rPr>
-        <w:t>The selected pipeline was re-trained on the full training set (800 applications) and evaluated on a stratified held-out test set (200 applications) that the model never saw during training. The confusion matrix and metrics below summarise its performance.</w:t>
+        <w:t>The selected pipeline was re-trained on the full training set (491 applications) and evaluated on a stratified held-out test set (123 applications) that the model never saw during training. The confusion matrix and metrics below summarise its performance.</w:t>
       </w:r>
     </w:p>
     <w:tbl>
@@ -2044,7 +2182,7 @@
               <w:rPr>
                 <w:rFonts w:ascii="Arial Narrow" w:hAnsi="Arial Narrow"/>
               </w:rPr>
-              <w:t>0.8350</w:t>
+              <w:t>0.8537</w:t>
             </w:r>
           </w:p>
         </w:tc>
@@ -2072,7 +2210,7 @@
               <w:rPr>
                 <w:rFonts w:ascii="Arial Narrow" w:hAnsi="Arial Narrow"/>
               </w:rPr>
-              <w:t>0.8372</w:t>
+              <w:t>0.8317</w:t>
             </w:r>
           </w:p>
         </w:tc>
@@ -2100,7 +2238,7 @@
               <w:rPr>
                 <w:rFonts w:ascii="Arial Narrow" w:hAnsi="Arial Narrow"/>
               </w:rPr>
-              <w:t>0.9664</w:t>
+              <w:t>0.9882</w:t>
             </w:r>
           </w:p>
         </w:tc>
@@ -2128,7 +2266,7 @@
               <w:rPr>
                 <w:rFonts w:ascii="Arial Narrow" w:hAnsi="Arial Narrow"/>
               </w:rPr>
-              <w:t>0.8972</w:t>
+              <w:t>0.9032</w:t>
             </w:r>
           </w:p>
         </w:tc>
@@ -2156,7 +2294,7 @@
               <w:rPr>
                 <w:rFonts w:ascii="Arial Narrow" w:hAnsi="Arial Narrow"/>
               </w:rPr>
-              <w:t>0.7627</w:t>
+              <w:t>0.7867</w:t>
             </w:r>
           </w:p>
         </w:tc>
@@ -2169,7 +2307,7 @@
           <w:b w:val="0"/>
           <w:i w:val="0"/>
         </w:rPr>
-        <w:t>The confusion matrix shows 23 true negatives, 28 false positives, 5 false negatives and 144 true positives. Recall is very high (96.6%), meaning the bank rarely overlooks a repayable applicant, which is the more costly error in a lending context. Precision of 83.7% indicates that most predicted approvals are correct.</w:t>
+        <w:t>The confusion matrix shows 21 true negatives, 17 false positives, 1 false negatives and 84 true positives. Recall is very high (98.8%), meaning the bank rarely overlooks a repayable applicant, which is the more costly error in a lending context. Precision of 83.2% indicates that most predicted approvals are correct.</w:t>
       </w:r>
     </w:p>
     <w:p>
@@ -2503,7 +2641,7 @@
           <w:b w:val="0"/>
           <w:i w:val="0"/>
         </w:rPr>
-        <w:t>A predicted probability of 0.5 is not necessarily the best decision cut-off for a lender. A false negative (rejecting a repayable applicant) is far cheaper than a false positive (approving a defaulter), so the cost ratio is asymmetric. Using an assumed cost ratio of 5.0 : 1.0, the expected-cost curve is minimised at a decision threshold of 0.27. At this operating point the model attains 84.0% accuracy, 83.8% precision, 97.3% recall and 0.901 F1. Because different business units accept different error costs, the threshold is exposed as a tunable parameter rather than fixed at 0.5, letting the bank move along its own precision-recall trade-off.</w:t>
+        <w:t>A predicted probability of 0.5 is not necessarily the best decision cut-off for a lender. A false negative (rejecting a repayable applicant) is far cheaper than a false positive (approving a defaulter), so the cost ratio is asymmetric. Using an assumed cost ratio of 5.0 : 1.0, the expected-cost curve is minimised at a decision threshold of 0.1. At this operating point the model attains 85.4% accuracy, 83.2% precision, 98.8% recall and 0.903 F1. Because different business units accept different error costs, the threshold is exposed as a tunable parameter rather than fixed at 0.5, letting the bank move along its own precision-recall trade-off.</w:t>
       </w:r>
     </w:p>
     <w:p>
@@ -2703,7 +2841,7 @@
           <w:b w:val="0"/>
           <w:i w:val="0"/>
         </w:rPr>
-        <w:t>Hyper-parameters of the selected logistic regression model were optimised with an exhaustive grid search over 4 parameter combinations, using stratified five-fold cross-validation and accuracy as the scoring function. The grid covered the regularisation strength C, the solver and the class-weight setting.</w:t>
+        <w:t>Hyper-parameters of the selected logistic regression model were optimised with an exhaustive grid search over 6 parameter combinations, using stratified five-fold cross-validation and accuracy as the scoring function. The grid covered the regularisation strength C, the solver and the class-weight setting.</w:t>
       </w:r>
     </w:p>
     <w:p>
@@ -2713,7 +2851,7 @@
           <w:b w:val="0"/>
           <w:i w:val="0"/>
         </w:rPr>
-        <w:t>Best parameters: {'clf__weights': [1, 1, 1]}</w:t>
+        <w:t>Best parameters: {'clf__C': 0.1, 'clf__kernel': 'linear'}</w:t>
       </w:r>
     </w:p>
     <w:p>
@@ -2723,7 +2861,7 @@
           <w:b w:val="0"/>
           <w:i w:val="0"/>
         </w:rPr>
-        <w:t>The tuned model achieved 83.5% test accuracy, 0.897 F1 and 0.763 ROC-AUC. The baseline and tuned configurations performed comparably, confirming that the default regularisation was already near-optimal and that the model is not over-fitting; the small C value selected indicates that moderate regularisation stabilises predictions.</w:t>
+        <w:t>The tuned model achieved 85.4% test accuracy, 0.903 F1 and 0.814 ROC-AUC. The baseline and tuned configurations performed comparably, confirming that the default regularisation was already near-optimal and that the model is not over-fitting; the small C value selected indicates that moderate regularisation stabilises predictions.</w:t>
       </w:r>
     </w:p>
     <w:p>
@@ -2819,7 +2957,7 @@
           <w:b w:val="0"/>
           <w:i w:val="0"/>
         </w:rPr>
-        <w:t>This project delivered a complete, reproducible machine learning system that predicts loan approval for Motz Financial Services. After rigorous cleaning, feature engineering and comparison of seven algorithms, logistic regression emerged as the best model, reaching 83.5% test accuracy and 0.763 ROC-AUC and clearly outperforming the majority-class baseline. The analysis confirms credit history as the dominant predictor, supported by income and loan-related features. The system is production-ready, served through an interactive dashboard and packaged with documentation and a one-command pipeline, providing a reliable and transparent decision-support tool for the client.</w:t>
+        <w:t>This project delivered a complete, reproducible machine learning system that predicts loan approval for Motz Financial Services. After rigorous cleaning, feature engineering and comparison of seven algorithms, logistic regression emerged as the best model, reaching 85.4% test accuracy and 0.814 ROC-AUC and clearly outperforming the majority-class baseline. The analysis confirms credit history as the dominant predictor, supported by income and loan-related features. The system is production-ready, served through an interactive dashboard and packaged with documentation and a one-command pipeline, providing a reliable and transparent decision-support tool for the client.</w:t>
       </w:r>
     </w:p>
     <w:p>

</xml_diff>